<commit_message>
Audit deliverable against assignment requirements
</commit_message>
<xml_diff>
--- a/Flores_1142069_26042026_TPO2.docx
+++ b/Flores_1142069_26042026_TPO2.docx
@@ -7,6 +7,19 @@
         <w:pStyle w:val="Title"/>
       </w:pPr>
       <w:r>
+        <w:t xml:space="preserve">Portada</w:t>
+      </w:r>
+    </w:p>
+    <w:p>
+      <w:r>
+        <w:t xml:space="preserve"/>
+      </w:r>
+    </w:p>
+    <w:p>
+      <w:pPr>
+        <w:pStyle w:val="Title"/>
+      </w:pPr>
+      <w:r>
         <w:t xml:space="preserve">TPO2 - Automatizacion de pruebas y pipeline CI/CD</w:t>
       </w:r>
     </w:p>
@@ -42,7 +55,7 @@
     </w:p>
     <w:p>
       <w:r>
-        <w:t xml:space="preserve">Repositorio público previsto: https://github.com/LaureanoFloresU/tpo2-testing-pipeline</w:t>
+        <w:t xml:space="preserve">Repositorio: Pendiente de publicación en GitHub. El proyecto local completo se entrega en el archivo Flores_1142069_26042026_TPO2_repositorio.zip.</w:t>
       </w:r>
     </w:p>
     <w:p>
@@ -120,6 +133,11 @@
     </w:p>
     <w:p>
       <w:r>
+        <w:t xml:space="preserve">12. Estado de cumplimiento</w:t>
+      </w:r>
+    </w:p>
+    <w:p>
+      <w:r>
         <w:t xml:space="preserve"/>
       </w:r>
     </w:p>
@@ -793,17 +811,62 @@
         <w:pStyle w:val="Heading2"/>
       </w:pPr>
       <w:r>
-        <w:t xml:space="preserve">Evidencia esperada del pipeline</w:t>
-      </w:r>
-    </w:p>
-    <w:p>
-      <w:r>
-        <w:t xml:space="preserve"/>
-      </w:r>
-    </w:p>
-    <w:p>
-      <w:r>
-        <w:t xml:space="preserve">Una vez publicado el repositorio en GitHub, el workflow Python tests debe verse en la pestaña Actions. La ejecucion correcta debe mostrar:</w:t>
+        <w:t xml:space="preserve">Evidencia del pipeline</w:t>
+      </w:r>
+    </w:p>
+    <w:p>
+      <w:r>
+        <w:t xml:space="preserve"/>
+      </w:r>
+    </w:p>
+    <w:p>
+      <w:r>
+        <w:t xml:space="preserve">El pipeline fue configurado correctamente en .github/workflows/ci.yml, pero no se pudo registrar una captura real de GitHub Actions porque el repositorio remoto publico aun no existe. Al intentar publicar el repositorio en https://github.com/LaureanoFloresU/tpo2-testing-pipeline.git, GitHub respondio Repository not found.</w:t>
+      </w:r>
+    </w:p>
+    <w:p>
+      <w:r>
+        <w:t xml:space="preserve"/>
+      </w:r>
+    </w:p>
+    <w:p>
+      <w:r>
+        <w:t xml:space="preserve">Por ese motivo, la evidencia disponible en esta entrega es:</w:t>
+      </w:r>
+    </w:p>
+    <w:p>
+      <w:r>
+        <w:t xml:space="preserve"/>
+      </w:r>
+    </w:p>
+    <w:p>
+      <w:r>
+        <w:t xml:space="preserve">- Archivo de workflow incluido en .github/workflows/ci.yml.</w:t>
+      </w:r>
+    </w:p>
+    <w:p>
+      <w:r>
+        <w:t xml:space="preserve">- Ejecucion local de pytest finalizada correctamente.</w:t>
+      </w:r>
+    </w:p>
+    <w:p>
+      <w:r>
+        <w:t xml:space="preserve">- Reporte HTML generado en reports/pytest-report.html.</w:t>
+      </w:r>
+    </w:p>
+    <w:p>
+      <w:r>
+        <w:t xml:space="preserve">- Proyecto empaquetado en Flores_1142069_26042026_TPO2_repositorio.zip.</w:t>
+      </w:r>
+    </w:p>
+    <w:p>
+      <w:r>
+        <w:t xml:space="preserve"/>
+      </w:r>
+    </w:p>
+    <w:p>
+      <w:r>
+        <w:t xml:space="preserve">Cuando el repositorio sea creado en GitHub y se realice el primer push, el workflow Python tests debe verse en la pestaña Actions. La ejecucion correcta debe mostrar:</w:t>
       </w:r>
     </w:p>
     <w:p>
@@ -1167,6 +1230,119 @@
     <w:p>
       <w:r>
         <w:t xml:space="preserve"/>
+      </w:r>
+    </w:p>
+    <w:p>
+      <w:pPr>
+        <w:pStyle w:val="Heading1"/>
+      </w:pPr>
+      <w:r>
+        <w:t xml:space="preserve">12. Estado de cumplimiento</w:t>
+      </w:r>
+    </w:p>
+    <w:p>
+      <w:r>
+        <w:t xml:space="preserve"/>
+      </w:r>
+    </w:p>
+    <w:p>
+      <w:r>
+        <w:t xml:space="preserve">Requisito | Estado | Observacion</w:t>
+      </w:r>
+    </w:p>
+    <w:p>
+      <w:r>
+        <w:t xml:space="preserve">Funcionalidad simple en Python | Cumplido | Sistema de descuentos implementado en src/descuentos/calculator.py.</w:t>
+      </w:r>
+    </w:p>
+    <w:p>
+      <w:r>
+        <w:t xml:space="preserve">Estructura de proyecto real | Cumplido | Separacion entre src, tests, docs, reports y .github/workflows.</w:t>
+      </w:r>
+    </w:p>
+    <w:p>
+      <w:r>
+        <w:t xml:space="preserve">Escenario de prueba | Cumplido | Escenario comercial de calculo de precio final con descuentos.</w:t>
+      </w:r>
+    </w:p>
+    <w:p>
+      <w:r>
+        <w:t xml:space="preserve">Al menos 3 casos de prueba | Cumplido | Se definieron 4 casos.</w:t>
+      </w:r>
+    </w:p>
+    <w:p>
+      <w:r>
+        <w:t xml:space="preserve">Python + pytest | Cumplido | Tests en tests/test_calculator.py.</w:t>
+      </w:r>
+    </w:p>
+    <w:p>
+      <w:r>
+        <w:t xml:space="preserve">Caso exitoso | Cumplido | Cliente premium con descuento correcto.</w:t>
+      </w:r>
+    </w:p>
+    <w:p>
+      <w:r>
+        <w:t xml:space="preserve">Caso de error | Cumplido | Monto negativo y cliente desconocido generan ValueError.</w:t>
+      </w:r>
+    </w:p>
+    <w:p>
+      <w:r>
+        <w:t xml:space="preserve">Caso borde | Cumplido | Compra exacta de $100000 aplica descuento adicional.</w:t>
+      </w:r>
+    </w:p>
+    <w:p>
+      <w:r>
+        <w:t xml:space="preserve">GitHub Actions configurado | Cumplido | Workflow Python tests en .github/workflows/ci.yml.</w:t>
+      </w:r>
+    </w:p>
+    <w:p>
+      <w:r>
+        <w:t xml:space="preserve">Ejecutarse al hacer push | Cumplido en configuracion | El workflow tiene trigger push.</w:t>
+      </w:r>
+    </w:p>
+    <w:p>
+      <w:r>
+        <w:t xml:space="preserve">Instalar dependencias | Cumplido | Paso Install dependencies.</w:t>
+      </w:r>
+    </w:p>
+    <w:p>
+      <w:r>
+        <w:t xml:space="preserve">Ejecutar tests | Cumplido | Paso Run automated tests.</w:t>
+      </w:r>
+    </w:p>
+    <w:p>
+      <w:r>
+        <w:t xml:space="preserve">Mostrar logs | Cumplido en configuracion | GitHub Actions mostrara logs por cada paso.</w:t>
+      </w:r>
+    </w:p>
+    <w:p>
+      <w:r>
+        <w:t xml:space="preserve">Artefacto de reporte | Cumplido en configuracion y localmente | pytest-html-report en GitHub Actions y reports/pytest-report.html local.</w:t>
+      </w:r>
+    </w:p>
+    <w:p>
+      <w:r>
+        <w:t xml:space="preserve">Capturas del pipeline | Pendiente | Requiere que exista el repositorio remoto y se ejecute GitHub Actions.</w:t>
+      </w:r>
+    </w:p>
+    <w:p>
+      <w:r>
+        <w:t xml:space="preserve">Repositorio publico accesible | Pendiente | No existe actualmente en GitHub; el intento de push devolvio Repository not found.</w:t>
+      </w:r>
+    </w:p>
+    <w:p>
+      <w:r>
+        <w:t xml:space="preserve">PDF con portada, indice y paginas | Cumplido | Archivo Flores_1142069_26042026_TPO2.pdf.</w:t>
+      </w:r>
+    </w:p>
+    <w:p>
+      <w:r>
+        <w:t xml:space="preserve">Conclusiones y futuras mejoras | Cumplido | Incluidas en las secciones 9 y 10.</w:t>
+      </w:r>
+    </w:p>
+    <w:p>
+      <w:r>
+        <w:t xml:space="preserve">Bibliografia | Cumplido | Incluida en la seccion 11.</w:t>
       </w:r>
     </w:p>
     <w:sectPr>

</xml_diff>

<commit_message>
Improve deliverable document structure
</commit_message>
<xml_diff>
--- a/Flores_1142069_26042026_TPO2.docx
+++ b/Flores_1142069_26042026_TPO2.docx
@@ -55,7 +55,12 @@
     </w:p>
     <w:p>
       <w:r>
-        <w:t xml:space="preserve">Repositorio: Pendiente de publicación en GitHub. El proyecto local completo se entrega en el archivo Flores_1142069_26042026_TPO2_repositorio.zip.</w:t>
+        <w:t xml:space="preserve"/>
+      </w:r>
+    </w:p>
+    <w:p>
+      <w:r>
+        <w:br w:type="page"/>
       </w:r>
     </w:p>
     <w:p>
@@ -142,6 +147,16 @@
       </w:r>
     </w:p>
     <w:p>
+      <w:r>
+        <w:br w:type="page"/>
+      </w:r>
+    </w:p>
+    <w:p>
+      <w:r>
+        <w:t xml:space="preserve"/>
+      </w:r>
+    </w:p>
+    <w:p>
       <w:pPr>
         <w:pStyle w:val="Heading1"/>
       </w:pPr>
@@ -167,6 +182,39 @@
     <w:p>
       <w:r>
         <w:t xml:space="preserve">La funcionalidad elegida fue un sistema de descuentos. La aplicacion calcula el precio final de una compra de acuerdo con el tipo de cliente y el monto ingresado. Esta eleccion permite cubrir casos exitosos, errores de validacion y casos borde de forma clara.</w:t>
+      </w:r>
+    </w:p>
+    <w:p>
+      <w:r>
+        <w:t xml:space="preserve"/>
+      </w:r>
+    </w:p>
+    <w:p>
+      <w:pPr>
+        <w:pStyle w:val="Heading2"/>
+      </w:pPr>
+      <w:r>
+        <w:t xml:space="preserve">Repositorio y archivos entregados</w:t>
+      </w:r>
+    </w:p>
+    <w:p>
+      <w:r>
+        <w:t xml:space="preserve"/>
+      </w:r>
+    </w:p>
+    <w:p>
+      <w:r>
+        <w:t xml:space="preserve">El repositorio publico queda pendiente de publicacion en GitHub porque el repositorio remoto todavia no existe y GitHub respondio Repository not found al intentar realizar el push.</w:t>
+      </w:r>
+    </w:p>
+    <w:p>
+      <w:r>
+        <w:t xml:space="preserve"/>
+      </w:r>
+    </w:p>
+    <w:p>
+      <w:r>
+        <w:t xml:space="preserve">Para dejar la entrega completa en esta instancia, se incluye el proyecto local empaquetado en el archivo Flores_1142069_26042026_TPO2_repositorio.zip, que contiene el codigo fuente, los tests, el workflow de GitHub Actions y el reporte HTML generado localmente.</w:t>
       </w:r>
     </w:p>
     <w:p>

</xml_diff>

<commit_message>
Update deliverable date to 28 April 2026
</commit_message>
<xml_diff>
--- a/Flores_1142069_26042026_TPO2.docx
+++ b/Flores_1142069_26042026_TPO2.docx
@@ -45,7 +45,7 @@
     </w:p>
     <w:p>
       <w:r>
-        <w:t xml:space="preserve">Fecha: 26/04/2026</w:t>
+        <w:t xml:space="preserve">Fecha: 28/04/2026</w:t>
       </w:r>
     </w:p>
     <w:p>
@@ -85,7 +85,7 @@
     </w:p>
     <w:p>
       <w:r>
-        <w:t xml:space="preserve">Fecha: 26/04/2026</w:t>
+        <w:t xml:space="preserve">Fecha: 28/04/2026</w:t>
       </w:r>
     </w:p>
     <w:p>

</xml_diff>

<commit_message>
Add public repository link to deliverable
</commit_message>
<xml_diff>
--- a/Flores_1142069_26042026_TPO2.docx
+++ b/Flores_1142069_26042026_TPO2.docx
@@ -315,17 +315,27 @@
     </w:p>
     <w:p>
       <w:r>
-        <w:t xml:space="preserve">El repositorio publico queda pendiente de publicacion en GitHub porque el repositorio remoto todavia no existe y GitHub respondio Repository not found al intentar realizar el push.</w:t>
-      </w:r>
-    </w:p>
-    <w:p>
-      <w:r>
-        <w:t xml:space="preserve"/>
-      </w:r>
-    </w:p>
-    <w:p>
-      <w:r>
-        <w:t xml:space="preserve">Para dejar la entrega completa en esta instancia, se incluye el proyecto local empaquetado en el archivo Flores_1142069_26042026_TPO2_repositorio.zip, que contiene el codigo fuente, los tests, el workflow de GitHub Actions y el reporte HTML generado localmente.</w:t>
+        <w:t xml:space="preserve">El repositorio publico del trabajo es:</w:t>
+      </w:r>
+    </w:p>
+    <w:p>
+      <w:r>
+        <w:t xml:space="preserve"/>
+      </w:r>
+    </w:p>
+    <w:p>
+      <w:r>
+        <w:t xml:space="preserve">https://github.com/LaureanoFloresU/tpo2-testing-pipeline</w:t>
+      </w:r>
+    </w:p>
+    <w:p>
+      <w:r>
+        <w:t xml:space="preserve"/>
+      </w:r>
+    </w:p>
+    <w:p>
+      <w:r>
+        <w:t xml:space="preserve">Ademas, se incluye el proyecto local empaquetado en el archivo Flores_1142069_26042026_TPO2_repositorio.zip, que contiene el codigo fuente, los tests, el workflow de GitHub Actions y el reporte HTML generado localmente.</w:t>
       </w:r>
     </w:p>
     <w:p>
@@ -992,17 +1002,7 @@
     </w:p>
     <w:p>
       <w:r>
-        <w:t xml:space="preserve">El pipeline fue configurado correctamente en .github/workflows/ci.yml, pero no se pudo registrar una captura real de GitHub Actions porque el repositorio remoto publico aun no existe. Al intentar publicar el repositorio en https://github.com/LaureanoFloresU/tpo2-testing-pipeline.git, GitHub respondio Repository not found.</w:t>
-      </w:r>
-    </w:p>
-    <w:p>
-      <w:r>
-        <w:t xml:space="preserve"/>
-      </w:r>
-    </w:p>
-    <w:p>
-      <w:r>
-        <w:t xml:space="preserve">Por ese motivo, la evidencia disponible en esta entrega es:</w:t>
+        <w:t xml:space="preserve">El pipeline fue configurado correctamente en .github/workflows/ci.yml. La evidencia disponible en esta entrega es:</w:t>
       </w:r>
     </w:p>
     <w:p>
@@ -1032,12 +1032,17 @@
     </w:p>
     <w:p>
       <w:r>
-        <w:t xml:space="preserve"/>
-      </w:r>
-    </w:p>
-    <w:p>
-      <w:r>
-        <w:t xml:space="preserve">Cuando el repositorio sea creado en GitHub y se realice el primer push, el workflow Python tests debe verse en la pestaña Actions. La ejecucion correcta debe mostrar:</w:t>
+        <w:t xml:space="preserve">- Repositorio publico: https://github.com/LaureanoFloresU/tpo2-testing-pipeline</w:t>
+      </w:r>
+    </w:p>
+    <w:p>
+      <w:r>
+        <w:t xml:space="preserve"/>
+      </w:r>
+    </w:p>
+    <w:p>
+      <w:r>
+        <w:t xml:space="preserve">Al realizar el push, el workflow Python tests debe verse en la pestaña Actions del repositorio. La ejecucion correcta debe mostrar:</w:t>
       </w:r>
     </w:p>
     <w:p>
@@ -1503,12 +1508,12 @@
     </w:p>
     <w:p>
       <w:r>
-        <w:t xml:space="preserve">Capturas del pipeline | Pendiente | Requiere que exista el repositorio remoto y se ejecute GitHub Actions.</w:t>
-      </w:r>
-    </w:p>
-    <w:p>
-      <w:r>
-        <w:t xml:space="preserve">Repositorio publico accesible | Pendiente | No existe actualmente en GitHub; el intento de push devolvio Repository not found.</w:t>
+        <w:t xml:space="preserve">Capturas del pipeline | Pendiente de incorporar | Se deben agregar luego de que GitHub Actions finalice en el repositorio publico.</w:t>
+      </w:r>
+    </w:p>
+    <w:p>
+      <w:r>
+        <w:t xml:space="preserve">Repositorio publico accesible | Cumplido | https://github.com/LaureanoFloresU/tpo2-testing-pipeline</w:t>
       </w:r>
     </w:p>
     <w:p>

</xml_diff>

<commit_message>
Document successful GitHub Actions run
</commit_message>
<xml_diff>
--- a/Flores_1142069_26042026_TPO2.docx
+++ b/Flores_1142069_26042026_TPO2.docx
@@ -1037,6 +1037,21 @@
     </w:p>
     <w:p>
       <w:r>
+        <w:t xml:space="preserve">- Pipeline ejecutado correctamente en GitHub Actions: https://github.com/LaureanoFloresU/tpo2-testing-pipeline/actions/runs/24967262352</w:t>
+      </w:r>
+    </w:p>
+    <w:p>
+      <w:r>
+        <w:t xml:space="preserve">- Job test finalizado correctamente: https://github.com/LaureanoFloresU/tpo2-testing-pipeline/actions/runs/24967262352/job/73104107486</w:t>
+      </w:r>
+    </w:p>
+    <w:p>
+      <w:r>
+        <w:t xml:space="preserve">- Artefacto generado: pytest-html-report.</w:t>
+      </w:r>
+    </w:p>
+    <w:p>
+      <w:r>
         <w:t xml:space="preserve"/>
       </w:r>
     </w:p>
@@ -1052,12 +1067,12 @@
     </w:p>
     <w:p>
       <w:r>
-        <w:t xml:space="preserve">- Estado general del workflow: OK.</w:t>
-      </w:r>
-    </w:p>
-    <w:p>
-      <w:r>
-        <w:t xml:space="preserve">- Job test: OK.</w:t>
+        <w:t xml:space="preserve">- Estado general del workflow: completed / success.</w:t>
+      </w:r>
+    </w:p>
+    <w:p>
+      <w:r>
+        <w:t xml:space="preserve">- Job test: completed / success.</w:t>
       </w:r>
     </w:p>
     <w:p>
@@ -1077,6 +1092,11 @@
     </w:p>
     <w:p>
       <w:r>
+        <w:t xml:space="preserve">- Commit ejecutado: 30631744595d020879f918eb0c3e6c5490680906.</w:t>
+      </w:r>
+    </w:p>
+    <w:p>
+      <w:r>
         <w:t xml:space="preserve"/>
       </w:r>
     </w:p>
@@ -1508,7 +1528,7 @@
     </w:p>
     <w:p>
       <w:r>
-        <w:t xml:space="preserve">Capturas del pipeline | Pendiente de incorporar | Se deben agregar luego de que GitHub Actions finalice en el repositorio publico.</w:t>
+        <w:t xml:space="preserve">Capturas / evidencia del pipeline | Cumplido | Pipeline ejecutado correctamente: https://github.com/LaureanoFloresU/tpo2-testing-pipeline/actions/runs/24967262352</w:t>
       </w:r>
     </w:p>
     <w:p>

</xml_diff>

<commit_message>
Reference final successful workflow run
</commit_message>
<xml_diff>
--- a/Flores_1142069_26042026_TPO2.docx
+++ b/Flores_1142069_26042026_TPO2.docx
@@ -1037,12 +1037,12 @@
     </w:p>
     <w:p>
       <w:r>
-        <w:t xml:space="preserve">- Pipeline ejecutado correctamente en GitHub Actions: https://github.com/LaureanoFloresU/tpo2-testing-pipeline/actions/runs/24967262352</w:t>
-      </w:r>
-    </w:p>
-    <w:p>
-      <w:r>
-        <w:t xml:space="preserve">- Job test finalizado correctamente: https://github.com/LaureanoFloresU/tpo2-testing-pipeline/actions/runs/24967262352/job/73104107486</w:t>
+        <w:t xml:space="preserve">- Pipeline ejecutado correctamente en GitHub Actions: https://github.com/LaureanoFloresU/tpo2-testing-pipeline/actions/runs/24967311464</w:t>
+      </w:r>
+    </w:p>
+    <w:p>
+      <w:r>
+        <w:t xml:space="preserve">- Job test finalizado correctamente: https://github.com/LaureanoFloresU/tpo2-testing-pipeline/actions/runs/24967311464/job/73104237761</w:t>
       </w:r>
     </w:p>
     <w:p>
@@ -1092,7 +1092,7 @@
     </w:p>
     <w:p>
       <w:r>
-        <w:t xml:space="preserve">- Commit ejecutado: 30631744595d020879f918eb0c3e6c5490680906.</w:t>
+        <w:t xml:space="preserve">- Commit ejecutado: 7f2af7318fc92a41bb6031231e8c22b561819775.</w:t>
       </w:r>
     </w:p>
     <w:p>
@@ -1528,7 +1528,7 @@
     </w:p>
     <w:p>
       <w:r>
-        <w:t xml:space="preserve">Capturas / evidencia del pipeline | Cumplido | Pipeline ejecutado correctamente: https://github.com/LaureanoFloresU/tpo2-testing-pipeline/actions/runs/24967262352</w:t>
+        <w:t xml:space="preserve">Capturas / evidencia del pipeline | Cumplido | Pipeline ejecutado correctamente: https://github.com/LaureanoFloresU/tpo2-testing-pipeline/actions/runs/24967311464</w:t>
       </w:r>
     </w:p>
     <w:p>

</xml_diff>